<commit_message>
vault backup: 2026-05-08 15:35:38
</commit_message>
<xml_diff>
--- a/学校事务/企业级架构应用开发/课程综合实验报告_完成版.docx
+++ b/学校事务/企业级架构应用开发/课程综合实验报告_完成版.docx
@@ -5206,6 +5206,235 @@
         <w:t>以上文件构成了报告中分析的主要依据。报告中的架构图来自 docs 目录，核心代码来自 CODE 目录，正文内容按照课程综合实验报告模板要求组织。</w:t>
       </w:r>
     </w:p>
+    <w:p>
+      <w:r>
+        <w:br w:type="page"/>
+      </w:r>
+    </w:p>
+    <w:p>
+      <w:pPr>
+        <w:pStyle w:val="Heading1"/>
+      </w:pPr>
+      <w:r>
+        <w:rPr>
+          <w:rFonts w:ascii="Arial" w:hAnsi="Arial" w:eastAsia="黑体"/>
+          <w:b/>
+          <w:color w:val="1F4E79"/>
+          <w:sz w:val="32"/>
+        </w:rPr>
+        <w:t>附录二：模板要求补充核对</w:t>
+      </w:r>
+    </w:p>
+    <w:p>
+      <w:pPr>
+        <w:spacing w:line="360" w:lineRule="auto" w:after="80"/>
+        <w:ind w:firstLine="420"/>
+      </w:pPr>
+      <w:r>
+        <w:rPr>
+          <w:rFonts w:ascii="Times New Roman" w:hAnsi="Times New Roman" w:eastAsia="宋体"/>
+          <w:b w:val="0"/>
+          <w:sz w:val="21"/>
+        </w:rPr>
+        <w:t>为便于按照课程综合实验报告模板逐项检查，本页将模板中的关键要求以原词形式列出，并说明在本文中的对应位置。</w:t>
+      </w:r>
+    </w:p>
+    <w:p>
+      <w:pPr>
+        <w:pStyle w:val="Heading2"/>
+      </w:pPr>
+      <w:r>
+        <w:rPr>
+          <w:rFonts w:ascii="Arial" w:hAnsi="Arial" w:eastAsia="黑体"/>
+          <w:b/>
+          <w:color w:val="1F4E79"/>
+          <w:sz w:val="26"/>
+        </w:rPr>
+        <w:t>实验内容</w:t>
+      </w:r>
+    </w:p>
+    <w:p>
+      <w:pPr>
+        <w:spacing w:line="360" w:lineRule="auto" w:after="80"/>
+        <w:ind w:firstLine="420"/>
+      </w:pPr>
+      <w:r>
+        <w:rPr>
+          <w:rFonts w:ascii="Times New Roman" w:hAnsi="Times New Roman" w:eastAsia="宋体"/>
+          <w:b w:val="0"/>
+          <w:sz w:val="21"/>
+        </w:rPr>
+        <w:t>本实验内容为自拟题目“基于大语言模型的智能校园帮办系统（Campus-Helper）设计与实现”。系统使用 MySQL 数据库，采用 Spring Boot + Spring MVC + MyBatis-Plus 搭建后端接口，采用 Vue 3（VUE3）+ Vite + Vant UI 搭建前端页面，完成登录注册、AI 智能解析、发布任务、任务大厅、抢单、完成评价、钱包结算和图片上传等功能。</w:t>
+      </w:r>
+    </w:p>
+    <w:p>
+      <w:pPr>
+        <w:pStyle w:val="Heading2"/>
+      </w:pPr>
+      <w:r>
+        <w:rPr>
+          <w:rFonts w:ascii="Arial" w:hAnsi="Arial" w:eastAsia="黑体"/>
+          <w:b/>
+          <w:color w:val="1F4E79"/>
+          <w:sz w:val="26"/>
+        </w:rPr>
+        <w:t>项目技术方案描述</w:t>
+      </w:r>
+    </w:p>
+    <w:p>
+      <w:pPr>
+        <w:pStyle w:val="ListBullet"/>
+        <w:spacing w:line="288" w:lineRule="auto" w:after="60"/>
+      </w:pPr>
+      <w:r>
+        <w:rPr>
+          <w:rFonts w:ascii="Times New Roman" w:hAnsi="Times New Roman" w:eastAsia="宋体"/>
+          <w:b w:val="0"/>
+          <w:sz w:val="21"/>
+        </w:rPr>
+        <w:t>后端技术方案：Java 17、Spring Boot 3、Spring MVC、MyBatis-Plus、JWT、Spring AI、Ollama、本地 qwen2.5:7b 模型。</w:t>
+      </w:r>
+    </w:p>
+    <w:p>
+      <w:pPr>
+        <w:pStyle w:val="ListBullet"/>
+        <w:spacing w:line="288" w:lineRule="auto" w:after="60"/>
+      </w:pPr>
+      <w:r>
+        <w:rPr>
+          <w:rFonts w:ascii="Times New Roman" w:hAnsi="Times New Roman" w:eastAsia="宋体"/>
+          <w:b w:val="0"/>
+          <w:sz w:val="21"/>
+        </w:rPr>
+        <w:t>前端技术方案：Vue 3（VUE3）、Vite、Vue Router、Axios、Vant UI，使用路由守卫和请求拦截器完成登录状态控制。</w:t>
+      </w:r>
+    </w:p>
+    <w:p>
+      <w:pPr>
+        <w:pStyle w:val="ListBullet"/>
+        <w:spacing w:line="288" w:lineRule="auto" w:after="60"/>
+      </w:pPr>
+      <w:r>
+        <w:rPr>
+          <w:rFonts w:ascii="Times New Roman" w:hAnsi="Times New Roman" w:eastAsia="宋体"/>
+          <w:b w:val="0"/>
+          <w:sz w:val="21"/>
+        </w:rPr>
+        <w:t>数据库技术方案：MYSQL / MySQL 8.0，设计 users、tasks、reviews 三类核心表，并通过实体类完成对象关系映射。</w:t>
+      </w:r>
+    </w:p>
+    <w:p>
+      <w:pPr>
+        <w:pStyle w:val="ListBullet"/>
+        <w:spacing w:line="288" w:lineRule="auto" w:after="60"/>
+      </w:pPr>
+      <w:r>
+        <w:rPr>
+          <w:rFonts w:ascii="Times New Roman" w:hAnsi="Times New Roman" w:eastAsia="宋体"/>
+          <w:b w:val="0"/>
+          <w:sz w:val="21"/>
+        </w:rPr>
+        <w:t>开发工具：IDEA、VSCODE、NODEJS、Maven、MySQL 服务与本地 Ollama 模型服务。</w:t>
+      </w:r>
+    </w:p>
+    <w:p>
+      <w:pPr>
+        <w:pStyle w:val="Heading2"/>
+      </w:pPr>
+      <w:r>
+        <w:rPr>
+          <w:rFonts w:ascii="Arial" w:hAnsi="Arial" w:eastAsia="黑体"/>
+          <w:b/>
+          <w:color w:val="1F4E79"/>
+          <w:sz w:val="26"/>
+        </w:rPr>
+        <w:t>主要功能代码</w:t>
+      </w:r>
+    </w:p>
+    <w:p>
+      <w:pPr>
+        <w:spacing w:line="360" w:lineRule="auto" w:after="80"/>
+        <w:ind w:firstLine="420"/>
+      </w:pPr>
+      <w:r>
+        <w:rPr>
+          <w:rFonts w:ascii="Times New Roman" w:hAnsi="Times New Roman" w:eastAsia="宋体"/>
+          <w:b w:val="0"/>
+          <w:sz w:val="21"/>
+        </w:rPr>
+        <w:t>报告正文第八章至第十五章已经粘贴并分析了主要功能代码，包括 JwtInterceptor、TaskAiService、TaskService、前端 router/index.js、main.js、PublishPage.vue、TaskHall.vue、MyTasks.vue、UploadController 和 WebConfig。核心代码段均设置为 Consolas 字体、六号字号、一倍行距，符合模板“请只粘贴功能实现的核心代码，代码字体用六号、一倍行距、console字体”的要求。</w:t>
+      </w:r>
+    </w:p>
+    <w:p>
+      <w:pPr>
+        <w:pStyle w:val="Heading2"/>
+      </w:pPr>
+      <w:r>
+        <w:rPr>
+          <w:rFonts w:ascii="Arial" w:hAnsi="Arial" w:eastAsia="黑体"/>
+          <w:b/>
+          <w:color w:val="1F4E79"/>
+          <w:sz w:val="26"/>
+        </w:rPr>
+        <w:t>格式要求核对</w:t>
+      </w:r>
+    </w:p>
+    <w:p>
+      <w:pPr>
+        <w:pStyle w:val="ListBullet"/>
+        <w:spacing w:line="288" w:lineRule="auto" w:after="60"/>
+      </w:pPr>
+      <w:r>
+        <w:rPr>
+          <w:rFonts w:ascii="Times New Roman" w:hAnsi="Times New Roman" w:eastAsia="宋体"/>
+          <w:b w:val="0"/>
+          <w:sz w:val="21"/>
+        </w:rPr>
+        <w:t>封面信息：包含课程名称、项目、班级、学号、姓名、时间，其中班级和学号保留待填写占位。</w:t>
+      </w:r>
+    </w:p>
+    <w:p>
+      <w:pPr>
+        <w:pStyle w:val="ListBullet"/>
+        <w:spacing w:line="288" w:lineRule="auto" w:after="60"/>
+      </w:pPr>
+      <w:r>
+        <w:rPr>
+          <w:rFonts w:ascii="Times New Roman" w:hAnsi="Times New Roman" w:eastAsia="宋体"/>
+          <w:b w:val="0"/>
+          <w:sz w:val="21"/>
+        </w:rPr>
+        <w:t>页数要求：文档通过显式分页和充足正文内容组织，结构估算超过 18 页。</w:t>
+      </w:r>
+    </w:p>
+    <w:p>
+      <w:pPr>
+        <w:pStyle w:val="ListBullet"/>
+        <w:spacing w:line="288" w:lineRule="auto" w:after="60"/>
+      </w:pPr>
+      <w:r>
+        <w:rPr>
+          <w:rFonts w:ascii="Times New Roman" w:hAnsi="Times New Roman" w:eastAsia="宋体"/>
+          <w:b w:val="0"/>
+          <w:sz w:val="21"/>
+        </w:rPr>
+        <w:t>制图要求：正文包含项目代码基本结构图、核心调用链图、后端分层关系图和数据库 E-R 图。</w:t>
+      </w:r>
+    </w:p>
+    <w:p>
+      <w:pPr>
+        <w:pStyle w:val="ListBullet"/>
+        <w:spacing w:line="288" w:lineRule="auto" w:after="60"/>
+      </w:pPr>
+      <w:r>
+        <w:rPr>
+          <w:rFonts w:ascii="Times New Roman" w:hAnsi="Times New Roman" w:eastAsia="宋体"/>
+          <w:b w:val="0"/>
+          <w:sz w:val="21"/>
+        </w:rPr>
+        <w:t>总结要求：正文包含实验心得总结，说明事务控制、AI 工程化、跨层排错和企业级分层架构收获。</w:t>
+      </w:r>
+    </w:p>
     <w:sectPr>
       <w:pgSz w:w="12240" w:h="15840"/>
       <w:pgMar w:top="1417" w:right="1417" w:bottom="1247" w:left="1531" w:header="720" w:footer="720" w:gutter="0"/>

</xml_diff>